<commit_message>
changed the approach of the first algorithm to be transform and conquer in the word document
</commit_message>
<xml_diff>
--- a/project.docx
+++ b/project.docx
@@ -95,57 +95,29 @@
               <w:rPr>
                 <w:rFonts w:ascii="Monospac821 BT" w:hAnsi="Monospac821 BT"/>
               </w:rPr>
-              <w:t xml:space="preserve">    </w:t>
-            </w:r>
-            <w:proofErr w:type="gramStart"/>
-            <w:r>
-              <w:rPr>
-                <w:rFonts w:ascii="Monospac821 BT" w:hAnsi="Monospac821 BT"/>
-              </w:rPr>
-              <w:t>prefix[</w:t>
-            </w:r>
-            <w:proofErr w:type="gramEnd"/>
-            <w:r>
-              <w:rPr>
-                <w:rFonts w:ascii="Monospac821 BT" w:hAnsi="Monospac821 BT"/>
-              </w:rPr>
-              <w:t>0] = 0</w:t>
-            </w:r>
-          </w:p>
-          <w:p>
-            <w:pPr>
-              <w:ind w:left="360"/>
-              <w:rPr>
-                <w:rFonts w:ascii="Monospac821 BT" w:hAnsi="Monospac821 BT"/>
-              </w:rPr>
-            </w:pPr>
-          </w:p>
-          <w:p>
-            <w:pPr>
-              <w:ind w:left="360"/>
-              <w:rPr>
-                <w:rFonts w:ascii="Monospac821 BT" w:hAnsi="Monospac821 BT"/>
-              </w:rPr>
-            </w:pPr>
-            <w:r>
-              <w:rPr>
-                <w:rFonts w:ascii="Monospac821 BT" w:hAnsi="Monospac821 BT"/>
-              </w:rPr>
-              <w:t xml:space="preserve">    for i from </w:t>
-            </w:r>
-            <w:proofErr w:type="gramStart"/>
-            <w:r>
-              <w:rPr>
-                <w:rFonts w:ascii="Monospac821 BT" w:hAnsi="Monospac821 BT"/>
-              </w:rPr>
-              <w:t>1</w:t>
-            </w:r>
-            <w:proofErr w:type="gramEnd"/>
-            <w:r>
-              <w:rPr>
-                <w:rFonts w:ascii="Monospac821 BT" w:hAnsi="Monospac821 BT"/>
-              </w:rPr>
-              <w:t xml:space="preserve"> to n:</w:t>
+              <w:t xml:space="preserve">    prefix[0] = 0</w:t>
+            </w:r>
+          </w:p>
+          <w:p>
+            <w:pPr>
+              <w:ind w:left="360"/>
+              <w:rPr>
+                <w:rFonts w:ascii="Monospac821 BT" w:hAnsi="Monospac821 BT"/>
+              </w:rPr>
+            </w:pPr>
+          </w:p>
+          <w:p>
+            <w:pPr>
+              <w:ind w:left="360"/>
+              <w:rPr>
+                <w:rFonts w:ascii="Monospac821 BT" w:hAnsi="Monospac821 BT"/>
+              </w:rPr>
+            </w:pPr>
+            <w:r>
+              <w:rPr>
+                <w:rFonts w:ascii="Monospac821 BT" w:hAnsi="Monospac821 BT"/>
+              </w:rPr>
+              <w:t xml:space="preserve">    for i from 1 to n:</w:t>
             </w:r>
           </w:p>
           <w:p>
@@ -260,49 +232,21 @@
               <w:rPr>
                 <w:rFonts w:ascii="Monospac821 BT" w:hAnsi="Monospac821 BT"/>
               </w:rPr>
-              <w:t xml:space="preserve">    for i from </w:t>
-            </w:r>
-            <w:proofErr w:type="gramStart"/>
-            <w:r>
-              <w:rPr>
-                <w:rFonts w:ascii="Monospac821 BT" w:hAnsi="Monospac821 BT"/>
-              </w:rPr>
-              <w:t>0</w:t>
-            </w:r>
-            <w:proofErr w:type="gramEnd"/>
-            <w:r>
-              <w:rPr>
-                <w:rFonts w:ascii="Monospac821 BT" w:hAnsi="Monospac821 BT"/>
-              </w:rPr>
-              <w:t xml:space="preserve"> to n:</w:t>
-            </w:r>
-          </w:p>
-          <w:p>
-            <w:pPr>
-              <w:ind w:left="360"/>
-              <w:rPr>
-                <w:rFonts w:ascii="Monospac821 BT" w:hAnsi="Monospac821 BT"/>
-              </w:rPr>
-            </w:pPr>
-            <w:r>
-              <w:rPr>
-                <w:rFonts w:ascii="Monospac821 BT" w:hAnsi="Monospac821 BT"/>
-              </w:rPr>
-              <w:t xml:space="preserve">        for j from i+1 </w:t>
-            </w:r>
-            <w:proofErr w:type="spellStart"/>
-            <w:r>
-              <w:rPr>
-                <w:rFonts w:ascii="Monospac821 BT" w:hAnsi="Monospac821 BT"/>
-              </w:rPr>
-              <w:t>to n</w:t>
-            </w:r>
-            <w:proofErr w:type="spellEnd"/>
-            <w:r>
-              <w:rPr>
-                <w:rFonts w:ascii="Monospac821 BT" w:hAnsi="Monospac821 BT"/>
-              </w:rPr>
-              <w:t>:</w:t>
+              <w:t xml:space="preserve">    for i from 0 to n:</w:t>
+            </w:r>
+          </w:p>
+          <w:p>
+            <w:pPr>
+              <w:ind w:left="360"/>
+              <w:rPr>
+                <w:rFonts w:ascii="Monospac821 BT" w:hAnsi="Monospac821 BT"/>
+              </w:rPr>
+            </w:pPr>
+            <w:r>
+              <w:rPr>
+                <w:rFonts w:ascii="Monospac821 BT" w:hAnsi="Monospac821 BT"/>
+              </w:rPr>
+              <w:t xml:space="preserve">        for j from i+1 to n:</w:t>
             </w:r>
           </w:p>
           <w:p>
@@ -330,21 +274,7 @@
               <w:rPr>
                 <w:rFonts w:ascii="Monospac821 BT" w:hAnsi="Monospac821 BT"/>
               </w:rPr>
-              <w:t xml:space="preserve">                maxLen = </w:t>
-            </w:r>
-            <w:proofErr w:type="gramStart"/>
-            <w:r>
-              <w:rPr>
-                <w:rFonts w:ascii="Monospac821 BT" w:hAnsi="Monospac821 BT"/>
-              </w:rPr>
-              <w:t>max(</w:t>
-            </w:r>
-            <w:proofErr w:type="gramEnd"/>
-            <w:r>
-              <w:rPr>
-                <w:rFonts w:ascii="Monospac821 BT" w:hAnsi="Monospac821 BT"/>
-              </w:rPr>
-              <w:t>maxLen, j - i)</w:t>
+              <w:t xml:space="preserve">                maxLen = max(maxLen, j - i)</w:t>
             </w:r>
           </w:p>
           <w:p>
@@ -500,25 +430,25 @@
                 <w:sz w:val="28"/>
                 <w:szCs w:val="28"/>
               </w:rPr>
-              <w:t xml:space="preserve">    for i in </w:t>
-            </w:r>
-            <w:proofErr w:type="gramStart"/>
-            <w:r>
+              <w:t xml:space="preserve">    for i in range(1, n + 1):</w:t>
+            </w:r>
+          </w:p>
+          <w:p>
+            <w:pPr>
+              <w:ind w:left="360"/>
               <w:rPr>
                 <w:color w:val="000000" w:themeColor="text1"/>
                 <w:sz w:val="28"/>
                 <w:szCs w:val="28"/>
               </w:rPr>
-              <w:t>range(</w:t>
-            </w:r>
-            <w:proofErr w:type="gramEnd"/>
+            </w:pPr>
             <w:r>
               <w:rPr>
                 <w:color w:val="000000" w:themeColor="text1"/>
                 <w:sz w:val="28"/>
                 <w:szCs w:val="28"/>
               </w:rPr>
-              <w:t>1, n + 1):</w:t>
+              <w:t xml:space="preserve">        if nums[i - 1] == 0:</w:t>
             </w:r>
           </w:p>
           <w:p>
@@ -536,25 +466,25 @@
                 <w:sz w:val="28"/>
                 <w:szCs w:val="28"/>
               </w:rPr>
-              <w:t xml:space="preserve">        if </w:t>
-            </w:r>
-            <w:proofErr w:type="gramStart"/>
-            <w:r>
+              <w:t xml:space="preserve">            prefix[i] = prefix[i - 1] - 1</w:t>
+            </w:r>
+          </w:p>
+          <w:p>
+            <w:pPr>
+              <w:ind w:left="360"/>
               <w:rPr>
                 <w:color w:val="000000" w:themeColor="text1"/>
                 <w:sz w:val="28"/>
                 <w:szCs w:val="28"/>
               </w:rPr>
-              <w:t>nums[</w:t>
-            </w:r>
-            <w:proofErr w:type="gramEnd"/>
+            </w:pPr>
             <w:r>
               <w:rPr>
                 <w:color w:val="000000" w:themeColor="text1"/>
                 <w:sz w:val="28"/>
                 <w:szCs w:val="28"/>
               </w:rPr>
-              <w:t>i - 1] == 0:</w:t>
+              <w:t xml:space="preserve">        else:</w:t>
             </w:r>
           </w:p>
           <w:p>
@@ -572,44 +502,46 @@
                 <w:sz w:val="28"/>
                 <w:szCs w:val="28"/>
               </w:rPr>
-              <w:t xml:space="preserve">            prefix[i] = </w:t>
-            </w:r>
-            <w:proofErr w:type="gramStart"/>
-            <w:r>
+              <w:t xml:space="preserve">            prefix[i] = prefix[i - 1] + 1</w:t>
+            </w:r>
+          </w:p>
+          <w:p>
+            <w:pPr>
+              <w:ind w:left="360"/>
               <w:rPr>
                 <w:color w:val="000000" w:themeColor="text1"/>
                 <w:sz w:val="28"/>
                 <w:szCs w:val="28"/>
               </w:rPr>
-              <w:t>prefix[</w:t>
-            </w:r>
-            <w:proofErr w:type="gramEnd"/>
-            <w:r>
+            </w:pPr>
+          </w:p>
+          <w:p>
+            <w:pPr>
+              <w:ind w:left="360"/>
               <w:rPr>
                 <w:color w:val="000000" w:themeColor="text1"/>
                 <w:sz w:val="28"/>
                 <w:szCs w:val="28"/>
               </w:rPr>
-              <w:t>i - 1] - 1</w:t>
-            </w:r>
-          </w:p>
-          <w:p>
-            <w:pPr>
-              <w:ind w:left="360"/>
+            </w:pPr>
+            <w:r>
               <w:rPr>
                 <w:color w:val="000000" w:themeColor="text1"/>
                 <w:sz w:val="28"/>
                 <w:szCs w:val="28"/>
               </w:rPr>
-            </w:pPr>
-            <w:r>
+              <w:t xml:space="preserve">    max_len = 0</w:t>
+            </w:r>
+          </w:p>
+          <w:p>
+            <w:pPr>
+              <w:ind w:left="360"/>
               <w:rPr>
                 <w:color w:val="000000" w:themeColor="text1"/>
                 <w:sz w:val="28"/>
                 <w:szCs w:val="28"/>
               </w:rPr>
-              <w:t xml:space="preserve">        else:</w:t>
-            </w:r>
+            </w:pPr>
           </w:p>
           <w:p>
             <w:pPr>
@@ -626,25 +558,25 @@
                 <w:sz w:val="28"/>
                 <w:szCs w:val="28"/>
               </w:rPr>
-              <w:t xml:space="preserve">            prefix[i] = </w:t>
-            </w:r>
-            <w:proofErr w:type="gramStart"/>
-            <w:r>
+              <w:t xml:space="preserve">    for i in range(n + 1):</w:t>
+            </w:r>
+          </w:p>
+          <w:p>
+            <w:pPr>
+              <w:ind w:left="360"/>
               <w:rPr>
                 <w:color w:val="000000" w:themeColor="text1"/>
                 <w:sz w:val="28"/>
                 <w:szCs w:val="28"/>
               </w:rPr>
-              <w:t>prefix[</w:t>
-            </w:r>
-            <w:proofErr w:type="gramEnd"/>
+            </w:pPr>
             <w:r>
               <w:rPr>
                 <w:color w:val="000000" w:themeColor="text1"/>
                 <w:sz w:val="28"/>
                 <w:szCs w:val="28"/>
               </w:rPr>
-              <w:t>i - 1] + 1</w:t>
+              <w:t xml:space="preserve">        for j in range(i + 1, n + 1):</w:t>
             </w:r>
           </w:p>
           <w:p>
@@ -656,159 +588,31 @@
                 <w:szCs w:val="28"/>
               </w:rPr>
             </w:pPr>
-          </w:p>
-          <w:p>
-            <w:pPr>
-              <w:ind w:left="360"/>
+            <w:r>
               <w:rPr>
                 <w:color w:val="000000" w:themeColor="text1"/>
                 <w:sz w:val="28"/>
                 <w:szCs w:val="28"/>
               </w:rPr>
-            </w:pPr>
-            <w:r>
+              <w:t xml:space="preserve">            if prefix[i] == prefix[j]:</w:t>
+            </w:r>
+          </w:p>
+          <w:p>
+            <w:pPr>
+              <w:ind w:left="360"/>
               <w:rPr>
                 <w:color w:val="000000" w:themeColor="text1"/>
                 <w:sz w:val="28"/>
                 <w:szCs w:val="28"/>
               </w:rPr>
-              <w:t xml:space="preserve">    max_len = 0</w:t>
-            </w:r>
-          </w:p>
-          <w:p>
-            <w:pPr>
-              <w:ind w:left="360"/>
+            </w:pPr>
+            <w:r>
               <w:rPr>
                 <w:color w:val="000000" w:themeColor="text1"/>
                 <w:sz w:val="28"/>
                 <w:szCs w:val="28"/>
               </w:rPr>
-            </w:pPr>
-          </w:p>
-          <w:p>
-            <w:pPr>
-              <w:ind w:left="360"/>
-              <w:rPr>
-                <w:color w:val="000000" w:themeColor="text1"/>
-                <w:sz w:val="28"/>
-                <w:szCs w:val="28"/>
-              </w:rPr>
-            </w:pPr>
-            <w:r>
-              <w:rPr>
-                <w:color w:val="000000" w:themeColor="text1"/>
-                <w:sz w:val="28"/>
-                <w:szCs w:val="28"/>
-              </w:rPr>
-              <w:t xml:space="preserve">    for i in </w:t>
-            </w:r>
-            <w:proofErr w:type="gramStart"/>
-            <w:r>
-              <w:rPr>
-                <w:color w:val="000000" w:themeColor="text1"/>
-                <w:sz w:val="28"/>
-                <w:szCs w:val="28"/>
-              </w:rPr>
-              <w:t>range(</w:t>
-            </w:r>
-            <w:proofErr w:type="gramEnd"/>
-            <w:r>
-              <w:rPr>
-                <w:color w:val="000000" w:themeColor="text1"/>
-                <w:sz w:val="28"/>
-                <w:szCs w:val="28"/>
-              </w:rPr>
-              <w:t>n + 1):</w:t>
-            </w:r>
-          </w:p>
-          <w:p>
-            <w:pPr>
-              <w:ind w:left="360"/>
-              <w:rPr>
-                <w:color w:val="000000" w:themeColor="text1"/>
-                <w:sz w:val="28"/>
-                <w:szCs w:val="28"/>
-              </w:rPr>
-            </w:pPr>
-            <w:r>
-              <w:rPr>
-                <w:color w:val="000000" w:themeColor="text1"/>
-                <w:sz w:val="28"/>
-                <w:szCs w:val="28"/>
-              </w:rPr>
-              <w:t xml:space="preserve">        for j in </w:t>
-            </w:r>
-            <w:proofErr w:type="gramStart"/>
-            <w:r>
-              <w:rPr>
-                <w:color w:val="000000" w:themeColor="text1"/>
-                <w:sz w:val="28"/>
-                <w:szCs w:val="28"/>
-              </w:rPr>
-              <w:t>range(</w:t>
-            </w:r>
-            <w:proofErr w:type="gramEnd"/>
-            <w:r>
-              <w:rPr>
-                <w:color w:val="000000" w:themeColor="text1"/>
-                <w:sz w:val="28"/>
-                <w:szCs w:val="28"/>
-              </w:rPr>
-              <w:t>i + 1, n + 1):</w:t>
-            </w:r>
-          </w:p>
-          <w:p>
-            <w:pPr>
-              <w:ind w:left="360"/>
-              <w:rPr>
-                <w:color w:val="000000" w:themeColor="text1"/>
-                <w:sz w:val="28"/>
-                <w:szCs w:val="28"/>
-              </w:rPr>
-            </w:pPr>
-            <w:r>
-              <w:rPr>
-                <w:color w:val="000000" w:themeColor="text1"/>
-                <w:sz w:val="28"/>
-                <w:szCs w:val="28"/>
-              </w:rPr>
-              <w:t xml:space="preserve">            if prefix[i] == prefix[j]:</w:t>
-            </w:r>
-          </w:p>
-          <w:p>
-            <w:pPr>
-              <w:ind w:left="360"/>
-              <w:rPr>
-                <w:color w:val="000000" w:themeColor="text1"/>
-                <w:sz w:val="28"/>
-                <w:szCs w:val="28"/>
-              </w:rPr>
-            </w:pPr>
-            <w:r>
-              <w:rPr>
-                <w:color w:val="000000" w:themeColor="text1"/>
-                <w:sz w:val="28"/>
-                <w:szCs w:val="28"/>
-              </w:rPr>
-              <w:t xml:space="preserve">                max_len = </w:t>
-            </w:r>
-            <w:proofErr w:type="gramStart"/>
-            <w:r>
-              <w:rPr>
-                <w:color w:val="000000" w:themeColor="text1"/>
-                <w:sz w:val="28"/>
-                <w:szCs w:val="28"/>
-              </w:rPr>
-              <w:t>max(</w:t>
-            </w:r>
-            <w:proofErr w:type="gramEnd"/>
-            <w:r>
-              <w:rPr>
-                <w:color w:val="000000" w:themeColor="text1"/>
-                <w:sz w:val="28"/>
-                <w:szCs w:val="28"/>
-              </w:rPr>
-              <w:t>max_len, j - i)</w:t>
+              <w:t xml:space="preserve">                max_len = max(max_len, j - i)</w:t>
             </w:r>
           </w:p>
           <w:p>
@@ -1059,6 +863,9 @@
             <m:t>​⋅n</m:t>
           </m:r>
           <m:r>
+            <m:rPr>
+              <m:sty m:val="p"/>
+            </m:rPr>
             <w:rPr>
               <w:rFonts w:eastAsiaTheme="minorEastAsia"/>
             </w:rPr>
@@ -1187,6 +994,9 @@
             </m:den>
           </m:f>
           <m:r>
+            <m:rPr>
+              <m:sty m:val="p"/>
+            </m:rPr>
             <w:rPr>
               <w:rFonts w:eastAsiaTheme="minorEastAsia"/>
             </w:rPr>
@@ -1391,6 +1201,9 @@
             </m:den>
           </m:f>
           <m:r>
+            <m:rPr>
+              <m:sty m:val="p"/>
+            </m:rPr>
             <w:rPr>
               <w:rFonts w:eastAsiaTheme="minorEastAsia"/>
             </w:rPr>
@@ -1488,10 +1301,7 @@
       </w:pPr>
       <w:r>
         <w:lastRenderedPageBreak/>
-        <w:t>2</w:t>
-      </w:r>
-      <w:r>
-        <w:t>- recursive:</w:t>
+        <w:t>2- recursive:</w:t>
       </w:r>
     </w:p>
     <w:p>
@@ -1797,89 +1607,35 @@
                 <w:sz w:val="28"/>
                 <w:szCs w:val="28"/>
               </w:rPr>
-              <w:t xml:space="preserve">            maxLen = </w:t>
-            </w:r>
-            <w:proofErr w:type="gramStart"/>
-            <w:r>
-              <w:rPr>
-                <w:rFonts w:ascii="Monospac821 BT" w:hAnsi="Monospac821 BT"/>
-                <w:sz w:val="28"/>
-                <w:szCs w:val="28"/>
-              </w:rPr>
-              <w:t>max(</w:t>
-            </w:r>
-            <w:proofErr w:type="gramEnd"/>
-            <w:r>
-              <w:rPr>
-                <w:rFonts w:ascii="Monospac821 BT" w:hAnsi="Monospac821 BT"/>
-                <w:sz w:val="28"/>
-                <w:szCs w:val="28"/>
-              </w:rPr>
-              <w:t>maxLen, i - start + 1)</w:t>
-            </w:r>
-          </w:p>
-          <w:p>
-            <w:pPr>
-              <w:ind w:left="360"/>
-              <w:rPr>
-                <w:rFonts w:ascii="Monospac821 BT" w:hAnsi="Monospac821 BT"/>
-                <w:sz w:val="28"/>
-                <w:szCs w:val="28"/>
-              </w:rPr>
-            </w:pPr>
-          </w:p>
-          <w:p>
-            <w:pPr>
-              <w:ind w:left="360"/>
-              <w:rPr>
-                <w:rFonts w:ascii="Monospac821 BT" w:hAnsi="Monospac821 BT"/>
-                <w:sz w:val="28"/>
-                <w:szCs w:val="28"/>
-              </w:rPr>
-            </w:pPr>
-            <w:r>
-              <w:rPr>
-                <w:rFonts w:ascii="Monospac821 BT" w:hAnsi="Monospac821 BT"/>
-                <w:sz w:val="28"/>
-                <w:szCs w:val="28"/>
-              </w:rPr>
-              <w:t xml:space="preserve">    return </w:t>
-            </w:r>
-            <w:proofErr w:type="gramStart"/>
-            <w:r>
-              <w:rPr>
-                <w:rFonts w:ascii="Monospac821 BT" w:hAnsi="Monospac821 BT"/>
-                <w:sz w:val="28"/>
-                <w:szCs w:val="28"/>
-              </w:rPr>
-              <w:t>max(</w:t>
-            </w:r>
-            <w:proofErr w:type="gramEnd"/>
-            <w:r>
-              <w:rPr>
-                <w:rFonts w:ascii="Monospac821 BT" w:hAnsi="Monospac821 BT"/>
-                <w:sz w:val="28"/>
-                <w:szCs w:val="28"/>
-              </w:rPr>
-              <w:t xml:space="preserve">maxLen, </w:t>
-            </w:r>
-            <w:proofErr w:type="gramStart"/>
-            <w:r>
-              <w:rPr>
-                <w:rFonts w:ascii="Monospac821 BT" w:hAnsi="Monospac821 BT"/>
-                <w:sz w:val="28"/>
-                <w:szCs w:val="28"/>
-              </w:rPr>
-              <w:t>helper(</w:t>
-            </w:r>
-            <w:proofErr w:type="gramEnd"/>
-            <w:r>
-              <w:rPr>
-                <w:rFonts w:ascii="Monospac821 BT" w:hAnsi="Monospac821 BT"/>
-                <w:sz w:val="28"/>
-                <w:szCs w:val="28"/>
-              </w:rPr>
-              <w:t>nums, start + 1))</w:t>
+              <w:t xml:space="preserve">            maxLen = max(maxLen, i - start + 1)</w:t>
+            </w:r>
+          </w:p>
+          <w:p>
+            <w:pPr>
+              <w:ind w:left="360"/>
+              <w:rPr>
+                <w:rFonts w:ascii="Monospac821 BT" w:hAnsi="Monospac821 BT"/>
+                <w:sz w:val="28"/>
+                <w:szCs w:val="28"/>
+              </w:rPr>
+            </w:pPr>
+          </w:p>
+          <w:p>
+            <w:pPr>
+              <w:ind w:left="360"/>
+              <w:rPr>
+                <w:rFonts w:ascii="Monospac821 BT" w:hAnsi="Monospac821 BT"/>
+                <w:sz w:val="28"/>
+                <w:szCs w:val="28"/>
+              </w:rPr>
+            </w:pPr>
+            <w:r>
+              <w:rPr>
+                <w:rFonts w:ascii="Monospac821 BT" w:hAnsi="Monospac821 BT"/>
+                <w:sz w:val="28"/>
+                <w:szCs w:val="28"/>
+              </w:rPr>
+              <w:t xml:space="preserve">    return max(maxLen, helper(nums, start + 1))</w:t>
             </w:r>
           </w:p>
         </w:tc>
@@ -2186,25 +1942,7 @@
                 <w:sz w:val="28"/>
                 <w:szCs w:val="28"/>
               </w:rPr>
-              <w:t xml:space="preserve">        for i in </w:t>
-            </w:r>
-            <w:proofErr w:type="gramStart"/>
-            <w:r>
-              <w:rPr>
-                <w:rFonts w:ascii="Monospac821 BT" w:hAnsi="Monospac821 BT"/>
-                <w:sz w:val="28"/>
-                <w:szCs w:val="28"/>
-              </w:rPr>
-              <w:t>range(</w:t>
-            </w:r>
-            <w:proofErr w:type="gramEnd"/>
-            <w:r>
-              <w:rPr>
-                <w:rFonts w:ascii="Monospac821 BT" w:hAnsi="Monospac821 BT"/>
-                <w:sz w:val="28"/>
-                <w:szCs w:val="28"/>
-              </w:rPr>
-              <w:t>start, len(nums)):</w:t>
+              <w:t xml:space="preserve">        for i in range(start, len(nums)):</w:t>
             </w:r>
           </w:p>
           <w:p>
@@ -2322,135 +2060,63 @@
                 <w:sz w:val="28"/>
                 <w:szCs w:val="28"/>
               </w:rPr>
-              <w:t xml:space="preserve">                max_len = </w:t>
-            </w:r>
-            <w:proofErr w:type="gramStart"/>
-            <w:r>
-              <w:rPr>
-                <w:rFonts w:ascii="Monospac821 BT" w:hAnsi="Monospac821 BT"/>
-                <w:sz w:val="28"/>
-                <w:szCs w:val="28"/>
-              </w:rPr>
-              <w:t>max(</w:t>
-            </w:r>
-            <w:proofErr w:type="gramEnd"/>
-            <w:r>
-              <w:rPr>
-                <w:rFonts w:ascii="Monospac821 BT" w:hAnsi="Monospac821 BT"/>
-                <w:sz w:val="28"/>
-                <w:szCs w:val="28"/>
-              </w:rPr>
-              <w:t>max_len, i - start + 1)</w:t>
-            </w:r>
-          </w:p>
-          <w:p>
-            <w:pPr>
-              <w:ind w:left="360"/>
-              <w:rPr>
-                <w:rFonts w:ascii="Monospac821 BT" w:hAnsi="Monospac821 BT"/>
-                <w:sz w:val="28"/>
-                <w:szCs w:val="28"/>
-              </w:rPr>
-            </w:pPr>
-          </w:p>
-          <w:p>
-            <w:pPr>
-              <w:ind w:left="360"/>
-              <w:rPr>
-                <w:rFonts w:ascii="Monospac821 BT" w:hAnsi="Monospac821 BT"/>
-                <w:sz w:val="28"/>
-                <w:szCs w:val="28"/>
-              </w:rPr>
-            </w:pPr>
-            <w:r>
-              <w:rPr>
-                <w:rFonts w:ascii="Monospac821 BT" w:hAnsi="Monospac821 BT"/>
-                <w:sz w:val="28"/>
-                <w:szCs w:val="28"/>
-              </w:rPr>
-              <w:t xml:space="preserve">        return </w:t>
-            </w:r>
-            <w:proofErr w:type="gramStart"/>
-            <w:r>
-              <w:rPr>
-                <w:rFonts w:ascii="Monospac821 BT" w:hAnsi="Monospac821 BT"/>
-                <w:sz w:val="28"/>
-                <w:szCs w:val="28"/>
-              </w:rPr>
-              <w:t>max(</w:t>
-            </w:r>
-            <w:proofErr w:type="gramEnd"/>
-            <w:r>
-              <w:rPr>
-                <w:rFonts w:ascii="Monospac821 BT" w:hAnsi="Monospac821 BT"/>
-                <w:sz w:val="28"/>
-                <w:szCs w:val="28"/>
-              </w:rPr>
-              <w:t xml:space="preserve">max_len, </w:t>
-            </w:r>
-            <w:proofErr w:type="gramStart"/>
-            <w:r>
-              <w:rPr>
-                <w:rFonts w:ascii="Monospac821 BT" w:hAnsi="Monospac821 BT"/>
-                <w:sz w:val="28"/>
-                <w:szCs w:val="28"/>
-              </w:rPr>
-              <w:t>helper(</w:t>
-            </w:r>
-            <w:proofErr w:type="gramEnd"/>
-            <w:r>
-              <w:rPr>
-                <w:rFonts w:ascii="Monospac821 BT" w:hAnsi="Monospac821 BT"/>
-                <w:sz w:val="28"/>
-                <w:szCs w:val="28"/>
-              </w:rPr>
-              <w:t>start + 1))</w:t>
-            </w:r>
-          </w:p>
-          <w:p>
-            <w:pPr>
-              <w:ind w:left="360"/>
-              <w:rPr>
-                <w:rFonts w:ascii="Monospac821 BT" w:hAnsi="Monospac821 BT"/>
-                <w:sz w:val="28"/>
-                <w:szCs w:val="28"/>
-              </w:rPr>
-            </w:pPr>
-          </w:p>
-          <w:p>
-            <w:pPr>
-              <w:ind w:left="360"/>
-              <w:rPr>
-                <w:rFonts w:ascii="Monospac821 BT" w:hAnsi="Monospac821 BT"/>
-                <w:sz w:val="28"/>
-                <w:szCs w:val="28"/>
-              </w:rPr>
-            </w:pPr>
-            <w:r>
-              <w:rPr>
-                <w:rFonts w:ascii="Monospac821 BT" w:hAnsi="Monospac821 BT"/>
-                <w:sz w:val="28"/>
-                <w:szCs w:val="28"/>
-              </w:rPr>
-              <w:t xml:space="preserve">    return </w:t>
-            </w:r>
-            <w:proofErr w:type="gramStart"/>
-            <w:r>
-              <w:rPr>
-                <w:rFonts w:ascii="Monospac821 BT" w:hAnsi="Monospac821 BT"/>
-                <w:sz w:val="28"/>
-                <w:szCs w:val="28"/>
-              </w:rPr>
-              <w:t>helper(</w:t>
-            </w:r>
-            <w:proofErr w:type="gramEnd"/>
-            <w:r>
-              <w:rPr>
-                <w:rFonts w:ascii="Monospac821 BT" w:hAnsi="Monospac821 BT"/>
-                <w:sz w:val="28"/>
-                <w:szCs w:val="28"/>
-              </w:rPr>
-              <w:t>0)</w:t>
+              <w:t xml:space="preserve">                max_len = max(max_len, i - start + 1)</w:t>
+            </w:r>
+          </w:p>
+          <w:p>
+            <w:pPr>
+              <w:ind w:left="360"/>
+              <w:rPr>
+                <w:rFonts w:ascii="Monospac821 BT" w:hAnsi="Monospac821 BT"/>
+                <w:sz w:val="28"/>
+                <w:szCs w:val="28"/>
+              </w:rPr>
+            </w:pPr>
+          </w:p>
+          <w:p>
+            <w:pPr>
+              <w:ind w:left="360"/>
+              <w:rPr>
+                <w:rFonts w:ascii="Monospac821 BT" w:hAnsi="Monospac821 BT"/>
+                <w:sz w:val="28"/>
+                <w:szCs w:val="28"/>
+              </w:rPr>
+            </w:pPr>
+            <w:r>
+              <w:rPr>
+                <w:rFonts w:ascii="Monospac821 BT" w:hAnsi="Monospac821 BT"/>
+                <w:sz w:val="28"/>
+                <w:szCs w:val="28"/>
+              </w:rPr>
+              <w:t xml:space="preserve">        return max(max_len, helper(start + 1))</w:t>
+            </w:r>
+          </w:p>
+          <w:p>
+            <w:pPr>
+              <w:ind w:left="360"/>
+              <w:rPr>
+                <w:rFonts w:ascii="Monospac821 BT" w:hAnsi="Monospac821 BT"/>
+                <w:sz w:val="28"/>
+                <w:szCs w:val="28"/>
+              </w:rPr>
+            </w:pPr>
+          </w:p>
+          <w:p>
+            <w:pPr>
+              <w:ind w:left="360"/>
+              <w:rPr>
+                <w:rFonts w:ascii="Monospac821 BT" w:hAnsi="Monospac821 BT"/>
+                <w:sz w:val="28"/>
+                <w:szCs w:val="28"/>
+              </w:rPr>
+            </w:pPr>
+            <w:r>
+              <w:rPr>
+                <w:rFonts w:ascii="Monospac821 BT" w:hAnsi="Monospac821 BT"/>
+                <w:sz w:val="28"/>
+                <w:szCs w:val="28"/>
+              </w:rPr>
+              <w:t xml:space="preserve">    return helper(0)</w:t>
             </w:r>
           </w:p>
         </w:tc>
@@ -2826,7 +2492,7 @@
       </w:tblPr>
       <w:tblGrid>
         <w:gridCol w:w="1820"/>
-        <w:gridCol w:w="1484"/>
+        <w:gridCol w:w="2479"/>
         <w:gridCol w:w="2378"/>
       </w:tblGrid>
       <w:tr>
@@ -3277,7 +2943,7 @@
           </w:tcPr>
           <w:p>
             <w:r>
-              <w:t>Prefix sum</w:t>
+              <w:t>Transform and conquer</w:t>
             </w:r>
           </w:p>
         </w:tc>
@@ -4229,6 +3895,7 @@
   <w:style w:type="character" w:default="1" w:styleId="DefaultParagraphFont">
     <w:name w:val="Default Paragraph Font"/>
     <w:uiPriority w:val="1"/>
+    <w:semiHidden/>
     <w:unhideWhenUsed/>
   </w:style>
   <w:style w:type="table" w:default="1" w:styleId="TableNormal">

</xml_diff>